<commit_message>
Them link GitHub vao file word
</commit_message>
<xml_diff>
--- a/TestPlan.docx
+++ b/TestPlan.docx
@@ -1068,6 +1068,34 @@
           <w:szCs w:val="28"/>
         </w:rPr>
         <w:t>.</w:t>
+      </w:r>
+    </w:p>
+    <w:p>
+      <w:pPr>
+        <w:rPr>
+          <w:rFonts w:ascii="Times New Roman" w:hAnsi="Times New Roman" w:cs="Times New Roman"/>
+          <w:sz w:val="28"/>
+          <w:szCs w:val="28"/>
+        </w:rPr>
+      </w:pPr>
+      <w:r>
+        <w:rPr>
+          <w:rFonts w:ascii="Times New Roman" w:hAnsi="Times New Roman" w:cs="Times New Roman"/>
+          <w:sz w:val="28"/>
+          <w:szCs w:val="28"/>
+        </w:rPr>
+        <w:t>Link GitHub:</w:t>
+      </w:r>
+      <w:r>
+        <w:t xml:space="preserve"> </w:t>
+      </w:r>
+      <w:r>
+        <w:rPr>
+          <w:rFonts w:ascii="Times New Roman" w:hAnsi="Times New Roman" w:cs="Times New Roman"/>
+          <w:sz w:val="28"/>
+          <w:szCs w:val="28"/>
+        </w:rPr>
+        <w:t>https://github.com/Thuan140/DBCLPM_TH.git</w:t>
       </w:r>
     </w:p>
     <w:p>
@@ -4238,6 +4266,7 @@
   <w:style w:type="character" w:default="1" w:styleId="DefaultParagraphFont">
     <w:name w:val="Default Paragraph Font"/>
     <w:uiPriority w:val="1"/>
+    <w:semiHidden/>
     <w:unhideWhenUsed/>
   </w:style>
   <w:style w:type="table" w:default="1" w:styleId="TableNormal">

</xml_diff>